<commit_message>
chore(dépôt): politiques RLS auth_tables.sql + livrables soutenance à jour (704 tests, auth)
- database/auth_tables.sql : politiques RLS actives (app_users, login_history)
- guide, PPT, mémoire alignés sur l'authentification et 704 tests
- doc d'audit de préparation ajouté

Co-Authored-By: Claude Opus 4.8 <noreply@anthropic.com>
</commit_message>
<xml_diff>
--- a/reports/soutenance/GUIDE_SOUTENANCE_MBEUMI.docx
+++ b/reports/soutenance/GUIDE_SOUTENANCE_MBEUMI.docx
@@ -577,7 +577,7 @@
           <w:sz w:val="22"/>
           <w:szCs w:val="22"/>
         </w:rPr>
-        <w:t xml:space="preserve">Chaque couche est pure et testée isolément — c'est ce qui rend les 694 tests possibles.</w:t>
+        <w:t xml:space="preserve">Chaque couche est pure et testée isolément — c'est ce qui rend les 704 tests possibles.</w:t>
       </w:r>
     </w:p>
     <w:p>
@@ -632,7 +632,7 @@
           <w:sz w:val="22"/>
           <w:szCs w:val="22"/>
         </w:rPr>
-        <w:t xml:space="preserve">694 tests automatisés</w:t>
+        <w:t xml:space="preserve">704 tests automatisés</w:t>
       </w:r>
     </w:p>
     <w:p>
@@ -1861,7 +1861,7 @@
           <w:sz w:val="22"/>
           <w:szCs w:val="22"/>
         </w:rPr>
-        <w:t xml:space="preserve">Le prototype est vérifié comme un produit : 694 tests automatisés, tous au vert — tests unitaires du moteur, tests d'intégration des pages, tests bout-en-bout du cycle enregistrer-recharger-superviser.</w:t>
+        <w:t xml:space="preserve">Le prototype est vérifié comme un produit : 704 tests automatisés, tous au vert — tests unitaires du moteur, tests d'intégration des pages, tests bout-en-bout du cycle enregistrer-recharger-superviser.</w:t>
       </w:r>
     </w:p>
     <w:p>
@@ -1911,7 +1911,7 @@
           <w:sz w:val="22"/>
           <w:szCs w:val="22"/>
         </w:rPr>
-        <w:t xml:space="preserve">694/694 tests</w:t>
+        <w:t xml:space="preserve">704/704 tests</w:t>
       </w:r>
     </w:p>
     <w:p>
@@ -2312,7 +2312,7 @@
           <w:sz w:val="22"/>
           <w:szCs w:val="22"/>
         </w:rPr>
-        <w:t xml:space="preserve">R. Des séries temporelles de température machine — aucune donnée personnelle, donc hors périmètre RGPD. La contrainte est la confidentialité industrielle : les formulations exactes et certains réglages restent anonymisés dans le mémoire (« mode client » dans l'application).</w:t>
+        <w:t xml:space="preserve">R. Les données procédé sont des séries de température machine — aucune donnée personnelle. Seul le module d'authentification stocke des emails de connexion (donnée personnelle minimale) dans login_history : usage interne, finalité traçabilité des accès, pas de profilage — périmètre RGPD maîtrisé. La contrainte principale reste la confidentialité industrielle : formulations et réglages anonymisés (« mode client »).</w:t>
       </w:r>
     </w:p>
     <w:p>
@@ -2373,6 +2373,66 @@
           <w:szCs w:val="22"/>
         </w:rPr>
         <w:t xml:space="preserve">R. Si, et c'est dit tel quel dans le mémoire : 8 essais, 798 fenêtres — c'est la limite structurante. C'est précisément pourquoi il y a l'augmentation documentée, la validation par run, l'étude de robustesse sur 10 seeds, et la conclusion que la consolidation exige de nouveaux essais.</w:t>
+      </w:r>
+    </w:p>
+    <w:p>
+      <w:pPr>
+        <w:spacing w:after="50" w:before="160"/>
+      </w:pPr>
+      <w:r>
+        <w:rPr>
+          <w:rFonts w:ascii="Calibri" w:cs="Calibri" w:eastAsia="Calibri" w:hAnsi="Calibri"/>
+          <w:b/>
+          <w:bCs/>
+          <w:color w:val="1A2330"/>
+          <w:sz w:val="22"/>
+          <w:szCs w:val="22"/>
+        </w:rPr>
+        <w:t xml:space="preserve">Q. Comment votre application interagit-elle avec la base de données ?</w:t>
+      </w:r>
+    </w:p>
+    <w:p>
+      <w:pPr>
+        <w:spacing w:after="110" w:line="276"/>
+      </w:pPr>
+      <w:r>
+        <w:rPr>
+          <w:rFonts w:ascii="Calibri" w:cs="Calibri" w:eastAsia="Calibri" w:hAnsi="Calibri"/>
+          <w:color w:val="1A2330"/>
+          <w:sz w:val="22"/>
+          <w:szCs w:val="22"/>
+        </w:rPr>
+        <w:t xml:space="preserve">R. Deux usages. D'abord la persistance de l'état procédé : le snapshot validé est écrit dans PostgreSQL (Supabase) via API REST, table rondol_state en JSONB — ce qui survit au disque éphémère de Streamlit Cloud. Ensuite l'authentification : la table app_users stocke les comptes (mot de passe hashé), et chaque connexion est journalisée dans login_history, visible dans la page Compte. Je peux le démontrer en direct : je me connecte, la ligne apparaît dans l'historique lu depuis la base.</w:t>
+      </w:r>
+    </w:p>
+    <w:p>
+      <w:pPr>
+        <w:spacing w:after="50" w:before="160"/>
+      </w:pPr>
+      <w:r>
+        <w:rPr>
+          <w:rFonts w:ascii="Calibri" w:cs="Calibri" w:eastAsia="Calibri" w:hAnsi="Calibri"/>
+          <w:b/>
+          <w:bCs/>
+          <w:color w:val="1A2330"/>
+          <w:sz w:val="22"/>
+          <w:szCs w:val="22"/>
+        </w:rPr>
+        <w:t xml:space="preserve">Q. Vos mots de passe, comment sont-ils stockés ?</w:t>
+      </w:r>
+    </w:p>
+    <w:p>
+      <w:pPr>
+        <w:spacing w:after="110" w:line="276"/>
+      </w:pPr>
+      <w:r>
+        <w:rPr>
+          <w:rFonts w:ascii="Calibri" w:cs="Calibri" w:eastAsia="Calibri" w:hAnsi="Calibri"/>
+          <w:color w:val="1A2330"/>
+          <w:sz w:val="22"/>
+          <w:szCs w:val="22"/>
+        </w:rPr>
+        <w:t xml:space="preserve">R. Jamais en clair. On stocke un hash PBKDF2-HMAC-SHA256 avec 200 000 itérations et un sel aléatoire par compte. Même avec un accès à la base, on ne peut pas remonter au mot de passe. Le code source public ne contient aucun mot de passe ; les identifiants de test sont documentés uniquement dans le PDR du ZIP de dépôt.</w:t>
       </w:r>
     </w:p>
     <w:p>

</xml_diff>

<commit_message>
chore(sync): 705 tests (auto-provision local ajouté), livrables réalignés
- 704→705 partout (mémoire, PDR, PPT, guide, check_sync) ; 11 tests auth
- mémoire/guide/PPT rebuild, check_sync vert, deck validé

Co-Authored-By: Claude Opus 4.8 <noreply@anthropic.com>
</commit_message>
<xml_diff>
--- a/reports/soutenance/GUIDE_SOUTENANCE_MBEUMI.docx
+++ b/reports/soutenance/GUIDE_SOUTENANCE_MBEUMI.docx
@@ -577,7 +577,7 @@
           <w:sz w:val="22"/>
           <w:szCs w:val="22"/>
         </w:rPr>
-        <w:t xml:space="preserve">Chaque couche est pure et testée isolément — c'est ce qui rend les 704 tests possibles.</w:t>
+        <w:t xml:space="preserve">Chaque couche est pure et testée isolément — c'est ce qui rend les 705 tests possibles.</w:t>
       </w:r>
     </w:p>
     <w:p>
@@ -632,7 +632,7 @@
           <w:sz w:val="22"/>
           <w:szCs w:val="22"/>
         </w:rPr>
-        <w:t xml:space="preserve">704 tests automatisés</w:t>
+        <w:t xml:space="preserve">705 tests automatisés</w:t>
       </w:r>
     </w:p>
     <w:p>
@@ -1861,7 +1861,7 @@
           <w:sz w:val="22"/>
           <w:szCs w:val="22"/>
         </w:rPr>
-        <w:t xml:space="preserve">Le prototype est vérifié comme un produit : 704 tests automatisés, tous au vert — tests unitaires du moteur, tests d'intégration des pages, tests bout-en-bout du cycle enregistrer-recharger-superviser.</w:t>
+        <w:t xml:space="preserve">Le prototype est vérifié comme un produit : 705 tests automatisés, tous au vert — tests unitaires du moteur, tests d'intégration des pages, tests bout-en-bout du cycle enregistrer-recharger-superviser.</w:t>
       </w:r>
     </w:p>
     <w:p>
@@ -1911,7 +1911,7 @@
           <w:sz w:val="22"/>
           <w:szCs w:val="22"/>
         </w:rPr>
-        <w:t xml:space="preserve">704/704 tests</w:t>
+        <w:t xml:space="preserve">705/705 tests</w:t>
       </w:r>
     </w:p>
     <w:p>

</xml_diff>

<commit_message>
fix(soutenance): PowerPoint et guide alignés sur l'app (7 pages + authentification)
Le PPT ne mentionnait pas l'authentification et affichait encore « 6 pages » ;
le guide idem. Corrigés :
- diapo Application : sous-titre « 7 pages, accès protégé », 7e carte
  « Compte & accès » (PBKDF2 + historique des connexions), grille 4×2
- couche HMI de l'architecture : page Compte ajoutée
- guide : « sept pages Streamlit », « 7 pages · accès protégé »
- contrôle géométrique : aucun texte hors cadre sur les 14 diapos

Co-Authored-By: Claude Opus 4.8 <noreply@anthropic.com>
</commit_message>
<xml_diff>
--- a/reports/soutenance/GUIDE_SOUTENANCE_MBEUMI.docx
+++ b/reports/soutenance/GUIDE_SOUTENANCE_MBEUMI.docx
@@ -1580,7 +1580,7 @@
           <w:sz w:val="22"/>
           <w:szCs w:val="22"/>
         </w:rPr>
-        <w:t xml:space="preserve">L'application, c'est six pages Streamlit type HMI industrielle : supervision avec score de stabilité et probabilité de dérive, configuration de vis avec KPIs recalculés à chaque geste, paramètres IA et doseurs, analyse de run, historique, et la vue moteur procédé.</w:t>
+        <w:t xml:space="preserve">L'application, c'est sept pages Streamlit type HMI industrielle : supervision avec score de stabilité et probabilité de dérive, configuration de vis avec KPIs recalculés à chaque geste, paramètres IA et doseurs, analyse de run, historique, et la vue moteur procédé.</w:t>
       </w:r>
     </w:p>
     <w:p>
@@ -1630,7 +1630,7 @@
           <w:sz w:val="22"/>
           <w:szCs w:val="22"/>
         </w:rPr>
-        <w:t xml:space="preserve">6 pages · FR/EN · persistance 3 couches · Streamlit + Supabase (PostgreSQL)</w:t>
+        <w:t xml:space="preserve">7 pages · accès protégé · FR/EN · persistance 3 couches · Streamlit + Supabase (PostgreSQL)</w:t>
       </w:r>
     </w:p>
     <w:p>

</xml_diff>

<commit_message>
fix(soutenance): PPT et guide alignés sur la méthode Kanban du mémoire
Le mémoire nomme désormais explicitement Kanban comme méthode de gestion de
projet (ajout précédent). Le PPT (diapo 12) et le guide (script diapo 12 +
Q&A) disaient encore "itérations agile" sans nommer la méthode — un jury
posant la question "quelle méthode ?" n'aurait pas trouvé le mot sur l'écran.
PREZ.pdf régénéré en conséquence.

Co-Authored-By: Claude Sonnet 4.5 <noreply@anthropic.com>
</commit_message>
<xml_diff>
--- a/reports/soutenance/GUIDE_SOUTENANCE_MBEUMI.docx
+++ b/reports/soutenance/GUIDE_SOUTENANCE_MBEUMI.docx
@@ -1711,7 +1711,7 @@
           <w:sz w:val="22"/>
           <w:szCs w:val="22"/>
         </w:rPr>
-        <w:t xml:space="preserve">Sur le pilotage : itérations courtes — chaque brique proposée, validée par l'encadrant, développée, testée, démontrée avant de passer à la suivante. Jalons tenus : campagne d'essais, bascule du modèle, démonstration manager du 16 juin.</w:t>
+        <w:t xml:space="preserve">Sur le pilotage : méthode Kanban — un flux tiré à encours limité (WIP=1), chaque brique proposée, validée par l'encadrant, développée, testée, démontrée avant de passer à la suivante. Jalons tenus : campagne d'essais, bascule du modèle, démonstration manager du 16 juin.</w:t>
       </w:r>
     </w:p>
     <w:p>
@@ -2474,7 +2474,7 @@
           <w:sz w:val="22"/>
           <w:szCs w:val="22"/>
         </w:rPr>
-        <w:t xml:space="preserve">R. Itérations courtes type agile adaptées à un binôme stagiaire-encadrant : chaque brique fait l'objet d'une proposition écrite (fichiers touchés, comportement avant/après, risques, tests, critères d'acceptation), validée avant développement, puis testée et démontrée. Le détail est en Partie 4 du mémoire.</w:t>
+        <w:t xml:space="preserve">R. Kanban — un flux tiré à encours limité fixé à un (WIP=1), adapté à un binôme stagiaire-encadrant plutôt qu'un Scrum à sprints fixes. Chaque brique fait l'objet d'une proposition écrite (fichiers touchés, comportement avant/après, risques, tests, critères d'acceptation), validée avant développement, puis testée et démontrée. Le détail est en Partie 4.1 du mémoire.</w:t>
       </w:r>
     </w:p>
     <w:p>

</xml_diff>

<commit_message>
fix(livrables): réaligner le compte de tests sur 725 dans tous les supports
Le contrôle de synchronisation attendait encore 705 tests et pointait vers
l'ancien support de soutenance, supprimé depuis. Il vise désormais le support
courant et vérifie qu'aucun compte périmé (693, 705, 720) n'y subsiste.

Les guides d'oral portaient 705 et 720 tests sur 75 fichiers ; la suite en
compte 725 répartis sur 76 fichiers, tous passants. Les guides sont corrigés
et le PDF reconverti depuis son DOCX.

Co-Authored-By: Claude Opus 5 <noreply@anthropic.com>
</commit_message>
<xml_diff>
--- a/reports/soutenance/GUIDE_SOUTENANCE_MBEUMI.docx
+++ b/reports/soutenance/GUIDE_SOUTENANCE_MBEUMI.docx
@@ -577,7 +577,7 @@
           <w:sz w:val="22"/>
           <w:szCs w:val="22"/>
         </w:rPr>
-        <w:t xml:space="preserve">Chaque couche est pure et testée isolément — c'est ce qui rend les 705 tests possibles.</w:t>
+        <w:t>Chaque couche est pure et testée isolément — c'est ce qui rend les 725 tests possibles.</w:t>
       </w:r>
     </w:p>
     <w:p>
@@ -632,7 +632,7 @@
           <w:sz w:val="22"/>
           <w:szCs w:val="22"/>
         </w:rPr>
-        <w:t xml:space="preserve">705 tests automatisés</w:t>
+        <w:t>725 tests automatisés</w:t>
       </w:r>
     </w:p>
     <w:p>
@@ -1861,7 +1861,7 @@
           <w:sz w:val="22"/>
           <w:szCs w:val="22"/>
         </w:rPr>
-        <w:t xml:space="preserve">Le prototype est vérifié comme un produit : 705 tests automatisés, tous au vert — tests unitaires du moteur, tests d'intégration des pages, tests bout-en-bout du cycle enregistrer-recharger-superviser.</w:t>
+        <w:t>Le prototype est vérifié comme un produit : 725 tests automatisés, tous au vert — tests unitaires du moteur, tests d'intégration des pages, tests bout-en-bout du cycle enregistrer-recharger-superviser.</w:t>
       </w:r>
     </w:p>
     <w:p>
@@ -1911,7 +1911,7 @@
           <w:sz w:val="22"/>
           <w:szCs w:val="22"/>
         </w:rPr>
-        <w:t xml:space="preserve">705/705 tests</w:t>
+        <w:t>725/725 tests</w:t>
       </w:r>
     </w:p>
     <w:p>

</xml_diff>